<commit_message>
adding sean's scope changes to project proposal
</commit_message>
<xml_diff>
--- a/project proposal.docx
+++ b/project proposal.docx
@@ -355,25 +355,7 @@
           <w:sz w:val="24"/>
           <w:szCs w:val="24"/>
         </w:rPr>
-        <w:t xml:space="preserve">Government - May inform which types of public sports facilities a governing body may invest in the construction of. Any governing body also benefits from their citizens maintaining their health as on average more healthy workers means a stronger and more stable workforce for manual </w:t>
-      </w:r>
-      <w:proofErr w:type="spellStart"/>
-      <w:r>
-        <w:rPr>
-          <w:rFonts w:ascii="Arial" w:hAnsi="Arial" w:cs="Arial"/>
-          <w:sz w:val="24"/>
-          <w:szCs w:val="24"/>
-        </w:rPr>
-        <w:t>labor</w:t>
-      </w:r>
-      <w:proofErr w:type="spellEnd"/>
-      <w:r>
-        <w:rPr>
-          <w:rFonts w:ascii="Arial" w:hAnsi="Arial" w:cs="Arial"/>
-          <w:sz w:val="24"/>
-          <w:szCs w:val="24"/>
-        </w:rPr>
-        <w:t xml:space="preserve"> jobs.</w:t>
+        <w:t>Government - May inform which types of public sports facilities a governing body may invest in the construction of. Any governing body also benefits from their citizens maintaining their health as on average more healthy workers means a stronger and more stable workforce for manual labor jobs.</w:t>
       </w:r>
     </w:p>
     <w:p>
@@ -442,43 +424,7 @@
           <w:sz w:val="24"/>
           <w:szCs w:val="24"/>
         </w:rPr>
-        <w:t xml:space="preserve">General public - Anyone from the physically infirm/inactive to those who exercise regularly would benefit from being more highly informed on clear and specific benefits of exercise. Increasing awareness of exercise benefits would promote a culture of health and wellness in the </w:t>
-      </w:r>
-      <w:proofErr w:type="gramStart"/>
-      <w:r>
-        <w:rPr>
-          <w:rFonts w:ascii="Arial" w:hAnsi="Arial" w:cs="Arial"/>
-          <w:sz w:val="24"/>
-          <w:szCs w:val="24"/>
-        </w:rPr>
-        <w:t>general public</w:t>
-      </w:r>
-      <w:proofErr w:type="gramEnd"/>
-      <w:r>
-        <w:rPr>
-          <w:rFonts w:ascii="Arial" w:hAnsi="Arial" w:cs="Arial"/>
-          <w:sz w:val="24"/>
-          <w:szCs w:val="24"/>
-        </w:rPr>
-        <w:t xml:space="preserve">, which would go on to influence many aspects of </w:t>
-      </w:r>
-      <w:proofErr w:type="gramStart"/>
-      <w:r>
-        <w:rPr>
-          <w:rFonts w:ascii="Arial" w:hAnsi="Arial" w:cs="Arial"/>
-          <w:sz w:val="24"/>
-          <w:szCs w:val="24"/>
-        </w:rPr>
-        <w:t>each individual's</w:t>
-      </w:r>
-      <w:proofErr w:type="gramEnd"/>
-      <w:r>
-        <w:rPr>
-          <w:rFonts w:ascii="Arial" w:hAnsi="Arial" w:cs="Arial"/>
-          <w:sz w:val="24"/>
-          <w:szCs w:val="24"/>
-        </w:rPr>
-        <w:t xml:space="preserve"> life.</w:t>
+        <w:t>General public - Anyone from the physically infirm/inactive to those who exercise regularly would benefit from being more highly informed on clear and specific benefits of exercise. Increasing awareness of exercise benefits would promote a culture of health and wellness in the general public, which would go on to influence many aspects of each individual's life.</w:t>
       </w:r>
     </w:p>
     <w:p>
@@ -524,57 +470,7 @@
           <w:sz w:val="24"/>
           <w:szCs w:val="24"/>
         </w:rPr>
-        <w:t xml:space="preserve">Potential unseen technical difficulties may arise. For </w:t>
-      </w:r>
-      <w:r>
-        <w:rPr>
-          <w:rFonts w:ascii="Arial" w:hAnsi="Arial" w:cs="Arial"/>
-          <w:sz w:val="24"/>
-          <w:szCs w:val="24"/>
-        </w:rPr>
-        <w:t>example,</w:t>
-      </w:r>
-      <w:r>
-        <w:rPr>
-          <w:rFonts w:ascii="Arial" w:hAnsi="Arial" w:cs="Arial"/>
-          <w:sz w:val="24"/>
-          <w:szCs w:val="24"/>
-        </w:rPr>
-        <w:t xml:space="preserve"> we’ve already faced issues with extracting .</w:t>
-      </w:r>
-      <w:proofErr w:type="spellStart"/>
-      <w:r>
-        <w:rPr>
-          <w:rFonts w:ascii="Arial" w:hAnsi="Arial" w:cs="Arial"/>
-          <w:sz w:val="24"/>
-          <w:szCs w:val="24"/>
-        </w:rPr>
-        <w:t>xpt</w:t>
-      </w:r>
-      <w:proofErr w:type="spellEnd"/>
-      <w:r>
-        <w:rPr>
-          <w:rFonts w:ascii="Arial" w:hAnsi="Arial" w:cs="Arial"/>
-          <w:sz w:val="24"/>
-          <w:szCs w:val="24"/>
-        </w:rPr>
-        <w:t xml:space="preserve"> files that contained a data </w:t>
-      </w:r>
-      <w:r>
-        <w:rPr>
-          <w:rFonts w:ascii="Arial" w:hAnsi="Arial" w:cs="Arial"/>
-          <w:sz w:val="24"/>
-          <w:szCs w:val="24"/>
-        </w:rPr>
-        <w:t>set and</w:t>
-      </w:r>
-      <w:r>
-        <w:rPr>
-          <w:rFonts w:ascii="Arial" w:hAnsi="Arial" w:cs="Arial"/>
-          <w:sz w:val="24"/>
-          <w:szCs w:val="24"/>
-        </w:rPr>
-        <w:t xml:space="preserve"> were only able to extract it thanks to hours of effort. If these types of technical difficulties keep springing out at us, it could dramatically balloon the time the project needs, which could push against deadlines</w:t>
+        <w:t>Potential unseen technical difficulties may arise. For example, we’ve already faced issues with extracting .xpt files that contained a data set and were only able to extract it thanks to hours of effort. If these types of technical difficulties keep springing out at us, it could dramatically balloon the time the project needs, which could push against deadlines</w:t>
       </w:r>
       <w:r>
         <w:rPr>
@@ -628,23 +524,7 @@
           <w:sz w:val="24"/>
           <w:szCs w:val="24"/>
         </w:rPr>
-        <w:t xml:space="preserve"> will need to be triple checked and ran through with a </w:t>
-      </w:r>
-      <w:r>
-        <w:rPr>
-          <w:rFonts w:ascii="Arial" w:hAnsi="Arial" w:cs="Arial"/>
-          <w:sz w:val="24"/>
-          <w:szCs w:val="24"/>
-        </w:rPr>
-        <w:t>fine-toothed</w:t>
-      </w:r>
-      <w:r>
-        <w:rPr>
-          <w:rFonts w:ascii="Arial" w:hAnsi="Arial" w:cs="Arial"/>
-          <w:sz w:val="24"/>
-          <w:szCs w:val="24"/>
-        </w:rPr>
-        <w:t xml:space="preserve"> comb, but there is always the risk of a mistake making its way through.</w:t>
+        <w:t xml:space="preserve"> will need to be triple checked and ran through with a fine-toothed comb, but there is always the risk of a mistake making its way through.</w:t>
       </w:r>
     </w:p>
     <w:p>
@@ -739,19 +619,226 @@
     </w:p>
     <w:p>
       <w:pPr>
-        <w:rPr>
-          <w:rFonts w:ascii="Arial" w:hAnsi="Arial" w:cs="Arial"/>
-        </w:rPr>
-      </w:pPr>
-    </w:p>
-    <w:p>
-      <w:pPr>
-        <w:rPr>
-          <w:rFonts w:ascii="Arial" w:hAnsi="Arial" w:cs="Arial"/>
-          <w:b/>
-          <w:bCs/>
-        </w:rPr>
-      </w:pPr>
+        <w:pStyle w:val="ListParagraph"/>
+        <w:numPr>
+          <w:ilvl w:val="0"/>
+          <w:numId w:val="5"/>
+        </w:numPr>
+        <w:rPr>
+          <w:rFonts w:ascii="Arial" w:hAnsi="Arial" w:cs="Arial"/>
+          <w:sz w:val="24"/>
+          <w:szCs w:val="24"/>
+        </w:rPr>
+      </w:pPr>
+      <w:r>
+        <w:rPr>
+          <w:rFonts w:ascii="Arial" w:hAnsi="Arial" w:cs="Arial"/>
+          <w:sz w:val="24"/>
+          <w:szCs w:val="24"/>
+        </w:rPr>
+        <w:t>This data in highly subjective to each participant. For example, some may interpret high and moderate activity to mean very different things. This subjectivity is an inherit flaw in self-reported data and while it does not undo the validity and helpfulness of this data it is important to acknowledge.</w:t>
+      </w:r>
+    </w:p>
+    <w:p>
+      <w:pPr>
+        <w:rPr>
+          <w:rFonts w:ascii="Arial" w:hAnsi="Arial" w:cs="Arial"/>
+        </w:rPr>
+      </w:pPr>
+      <w:r>
+        <w:rPr>
+          <w:rFonts w:ascii="Arial" w:hAnsi="Arial" w:cs="Arial"/>
+        </w:rPr>
+        <w:br/>
+      </w:r>
+      <w:r>
+        <w:rPr>
+          <w:rFonts w:ascii="Arial" w:hAnsi="Arial" w:cs="Arial"/>
+        </w:rPr>
+        <w:t>Our project is focusing on the potential links between frequency and intensity of physical activity and general activity level.</w:t>
+      </w:r>
+      <w:r>
+        <w:rPr>
+          <w:rFonts w:ascii="Arial" w:hAnsi="Arial" w:cs="Arial"/>
+        </w:rPr>
+        <w:t xml:space="preserve"> W</w:t>
+      </w:r>
+      <w:r>
+        <w:rPr>
+          <w:rFonts w:ascii="Arial" w:hAnsi="Arial" w:cs="Arial"/>
+        </w:rPr>
+        <w:t xml:space="preserve">e will be investigating </w:t>
+      </w:r>
+      <w:r>
+        <w:rPr>
+          <w:rFonts w:ascii="Arial" w:hAnsi="Arial" w:cs="Arial"/>
+        </w:rPr>
+        <w:t xml:space="preserve">the following: </w:t>
+      </w:r>
+    </w:p>
+    <w:p>
+      <w:pPr>
+        <w:numPr>
+          <w:ilvl w:val="0"/>
+          <w:numId w:val="8"/>
+        </w:numPr>
+        <w:spacing w:after="0"/>
+        <w:rPr>
+          <w:rFonts w:ascii="Arial" w:hAnsi="Arial" w:cs="Arial"/>
+        </w:rPr>
+      </w:pPr>
+      <w:r>
+        <w:rPr>
+          <w:rFonts w:ascii="Arial" w:hAnsi="Arial" w:cs="Arial"/>
+        </w:rPr>
+        <w:t>A systematic review of the data, analysing intensity and frequency from our source on the amount of people per 100 that participate in physical activity including exercise types. Including a detailed audit of the data</w:t>
+      </w:r>
+    </w:p>
+    <w:p>
+      <w:pPr>
+        <w:numPr>
+          <w:ilvl w:val="0"/>
+          <w:numId w:val="8"/>
+        </w:numPr>
+        <w:spacing w:after="0"/>
+        <w:rPr>
+          <w:rFonts w:ascii="Arial" w:hAnsi="Arial" w:cs="Arial"/>
+        </w:rPr>
+      </w:pPr>
+      <w:r>
+        <w:rPr>
+          <w:rFonts w:ascii="Arial" w:hAnsi="Arial" w:cs="Arial"/>
+        </w:rPr>
+        <w:t>Calculation of an impact score, a perceived impact rating from expert stakeholders as well as analysis between the impact and feasibility of exercise frequency. This will help us determine an appropriate amount and type of exercise to make a significant difference depending on feasible amount of free time</w:t>
+      </w:r>
+    </w:p>
+    <w:p>
+      <w:pPr>
+        <w:numPr>
+          <w:ilvl w:val="0"/>
+          <w:numId w:val="8"/>
+        </w:numPr>
+        <w:rPr>
+          <w:rFonts w:ascii="Arial" w:hAnsi="Arial" w:cs="Arial"/>
+        </w:rPr>
+      </w:pPr>
+      <w:r>
+        <w:rPr>
+          <w:rFonts w:ascii="Arial" w:hAnsi="Arial" w:cs="Arial"/>
+        </w:rPr>
+        <w:t>A review and visualisation of correlation between moderate and vigorous activity rates in comparison to sitting time</w:t>
+      </w:r>
+    </w:p>
+    <w:p>
+      <w:pPr>
+        <w:rPr>
+          <w:rFonts w:ascii="Arial" w:hAnsi="Arial" w:cs="Arial"/>
+        </w:rPr>
+      </w:pPr>
+      <w:r>
+        <w:rPr>
+          <w:rFonts w:ascii="Arial" w:hAnsi="Arial" w:cs="Arial"/>
+        </w:rPr>
+        <w:t>We will not investigate the following</w:t>
+      </w:r>
+      <w:r>
+        <w:rPr>
+          <w:rFonts w:ascii="Arial" w:hAnsi="Arial" w:cs="Arial"/>
+        </w:rPr>
+        <w:t xml:space="preserve">: </w:t>
+      </w:r>
+    </w:p>
+    <w:p>
+      <w:pPr>
+        <w:pStyle w:val="ListParagraph"/>
+        <w:numPr>
+          <w:ilvl w:val="0"/>
+          <w:numId w:val="9"/>
+        </w:numPr>
+        <w:rPr>
+          <w:rFonts w:ascii="Arial" w:hAnsi="Arial" w:cs="Arial"/>
+          <w:sz w:val="24"/>
+          <w:szCs w:val="24"/>
+        </w:rPr>
+      </w:pPr>
+      <w:r>
+        <w:rPr>
+          <w:rFonts w:ascii="Arial" w:hAnsi="Arial" w:cs="Arial"/>
+          <w:sz w:val="24"/>
+          <w:szCs w:val="24"/>
+        </w:rPr>
+        <w:t xml:space="preserve">We will not be </w:t>
+      </w:r>
+      <w:r>
+        <w:rPr>
+          <w:rFonts w:ascii="Arial" w:hAnsi="Arial" w:cs="Arial"/>
+          <w:sz w:val="24"/>
+          <w:szCs w:val="24"/>
+        </w:rPr>
+        <w:t>considering</w:t>
+      </w:r>
+      <w:r>
+        <w:rPr>
+          <w:rFonts w:ascii="Arial" w:hAnsi="Arial" w:cs="Arial"/>
+          <w:sz w:val="24"/>
+          <w:szCs w:val="24"/>
+        </w:rPr>
+        <w:t xml:space="preserve"> irrelevant data such as types of exercise routines as they would drastically increase our workload for little return</w:t>
+      </w:r>
+      <w:r>
+        <w:rPr>
+          <w:rFonts w:ascii="Arial" w:hAnsi="Arial" w:cs="Arial"/>
+          <w:sz w:val="24"/>
+          <w:szCs w:val="24"/>
+        </w:rPr>
+        <w:t>.</w:t>
+      </w:r>
+    </w:p>
+    <w:p>
+      <w:pPr>
+        <w:pStyle w:val="ListParagraph"/>
+        <w:numPr>
+          <w:ilvl w:val="0"/>
+          <w:numId w:val="9"/>
+        </w:numPr>
+        <w:rPr>
+          <w:rFonts w:ascii="Arial" w:hAnsi="Arial" w:cs="Arial"/>
+          <w:sz w:val="24"/>
+          <w:szCs w:val="24"/>
+        </w:rPr>
+      </w:pPr>
+      <w:r>
+        <w:rPr>
+          <w:rFonts w:ascii="Arial" w:hAnsi="Arial" w:cs="Arial"/>
+          <w:sz w:val="24"/>
+          <w:szCs w:val="24"/>
+        </w:rPr>
+        <w:t xml:space="preserve">We will not be gathering data from within the student body due to both privacy reasons and </w:t>
+      </w:r>
+      <w:r>
+        <w:rPr>
+          <w:rFonts w:ascii="Arial" w:hAnsi="Arial" w:cs="Arial"/>
+          <w:sz w:val="24"/>
+          <w:szCs w:val="24"/>
+        </w:rPr>
+        <w:t xml:space="preserve">the </w:t>
+      </w:r>
+      <w:r>
+        <w:rPr>
+          <w:rFonts w:ascii="Arial" w:hAnsi="Arial" w:cs="Arial"/>
+          <w:sz w:val="24"/>
+          <w:szCs w:val="24"/>
+        </w:rPr>
+        <w:t>small sample siz</w:t>
+      </w:r>
+      <w:r>
+        <w:rPr>
+          <w:rFonts w:ascii="Arial" w:hAnsi="Arial" w:cs="Arial"/>
+          <w:sz w:val="24"/>
+          <w:szCs w:val="24"/>
+        </w:rPr>
+        <w:t>e.</w:t>
+      </w:r>
     </w:p>
     <w:sectPr>
       <w:pgSz w:w="11906" w:h="16838"/>
@@ -879,6 +966,268 @@
     </w:lvl>
   </w:abstractNum>
   <w:abstractNum w:abstractNumId="1" w15:restartNumberingAfterBreak="0">
+    <w:nsid w:val="17BF3133"/>
+    <w:multiLevelType w:val="hybridMultilevel"/>
+    <w:tmpl w:val="9DD0DF28"/>
+    <w:lvl w:ilvl="0" w:tplc="18090001">
+      <w:start w:val="1"/>
+      <w:numFmt w:val="bullet"/>
+      <w:lvlText w:val=""/>
+      <w:lvlJc w:val="left"/>
+      <w:pPr>
+        <w:ind w:left="1080" w:hanging="360"/>
+      </w:pPr>
+      <w:rPr>
+        <w:rFonts w:ascii="Symbol" w:hAnsi="Symbol" w:hint="default"/>
+      </w:rPr>
+    </w:lvl>
+    <w:lvl w:ilvl="1" w:tplc="18090003" w:tentative="1">
+      <w:start w:val="1"/>
+      <w:numFmt w:val="bullet"/>
+      <w:lvlText w:val="o"/>
+      <w:lvlJc w:val="left"/>
+      <w:pPr>
+        <w:ind w:left="1800" w:hanging="360"/>
+      </w:pPr>
+      <w:rPr>
+        <w:rFonts w:ascii="Courier New" w:hAnsi="Courier New" w:cs="Courier New" w:hint="default"/>
+      </w:rPr>
+    </w:lvl>
+    <w:lvl w:ilvl="2" w:tplc="18090005" w:tentative="1">
+      <w:start w:val="1"/>
+      <w:numFmt w:val="bullet"/>
+      <w:lvlText w:val=""/>
+      <w:lvlJc w:val="left"/>
+      <w:pPr>
+        <w:ind w:left="2520" w:hanging="360"/>
+      </w:pPr>
+      <w:rPr>
+        <w:rFonts w:ascii="Wingdings" w:hAnsi="Wingdings" w:hint="default"/>
+      </w:rPr>
+    </w:lvl>
+    <w:lvl w:ilvl="3" w:tplc="18090001" w:tentative="1">
+      <w:start w:val="1"/>
+      <w:numFmt w:val="bullet"/>
+      <w:lvlText w:val=""/>
+      <w:lvlJc w:val="left"/>
+      <w:pPr>
+        <w:ind w:left="3240" w:hanging="360"/>
+      </w:pPr>
+      <w:rPr>
+        <w:rFonts w:ascii="Symbol" w:hAnsi="Symbol" w:hint="default"/>
+      </w:rPr>
+    </w:lvl>
+    <w:lvl w:ilvl="4" w:tplc="18090003" w:tentative="1">
+      <w:start w:val="1"/>
+      <w:numFmt w:val="bullet"/>
+      <w:lvlText w:val="o"/>
+      <w:lvlJc w:val="left"/>
+      <w:pPr>
+        <w:ind w:left="3960" w:hanging="360"/>
+      </w:pPr>
+      <w:rPr>
+        <w:rFonts w:ascii="Courier New" w:hAnsi="Courier New" w:cs="Courier New" w:hint="default"/>
+      </w:rPr>
+    </w:lvl>
+    <w:lvl w:ilvl="5" w:tplc="18090005" w:tentative="1">
+      <w:start w:val="1"/>
+      <w:numFmt w:val="bullet"/>
+      <w:lvlText w:val=""/>
+      <w:lvlJc w:val="left"/>
+      <w:pPr>
+        <w:ind w:left="4680" w:hanging="360"/>
+      </w:pPr>
+      <w:rPr>
+        <w:rFonts w:ascii="Wingdings" w:hAnsi="Wingdings" w:hint="default"/>
+      </w:rPr>
+    </w:lvl>
+    <w:lvl w:ilvl="6" w:tplc="18090001" w:tentative="1">
+      <w:start w:val="1"/>
+      <w:numFmt w:val="bullet"/>
+      <w:lvlText w:val=""/>
+      <w:lvlJc w:val="left"/>
+      <w:pPr>
+        <w:ind w:left="5400" w:hanging="360"/>
+      </w:pPr>
+      <w:rPr>
+        <w:rFonts w:ascii="Symbol" w:hAnsi="Symbol" w:hint="default"/>
+      </w:rPr>
+    </w:lvl>
+    <w:lvl w:ilvl="7" w:tplc="18090003" w:tentative="1">
+      <w:start w:val="1"/>
+      <w:numFmt w:val="bullet"/>
+      <w:lvlText w:val="o"/>
+      <w:lvlJc w:val="left"/>
+      <w:pPr>
+        <w:ind w:left="6120" w:hanging="360"/>
+      </w:pPr>
+      <w:rPr>
+        <w:rFonts w:ascii="Courier New" w:hAnsi="Courier New" w:cs="Courier New" w:hint="default"/>
+      </w:rPr>
+    </w:lvl>
+    <w:lvl w:ilvl="8" w:tplc="18090005" w:tentative="1">
+      <w:start w:val="1"/>
+      <w:numFmt w:val="bullet"/>
+      <w:lvlText w:val=""/>
+      <w:lvlJc w:val="left"/>
+      <w:pPr>
+        <w:ind w:left="6840" w:hanging="360"/>
+      </w:pPr>
+      <w:rPr>
+        <w:rFonts w:ascii="Wingdings" w:hAnsi="Wingdings" w:hint="default"/>
+      </w:rPr>
+    </w:lvl>
+  </w:abstractNum>
+  <w:abstractNum w:abstractNumId="2" w15:restartNumberingAfterBreak="0">
+    <w:nsid w:val="184B2203"/>
+    <w:multiLevelType w:val="multilevel"/>
+    <w:tmpl w:val="04EC0AE6"/>
+    <w:lvl w:ilvl="0">
+      <w:start w:val="1"/>
+      <w:numFmt w:val="bullet"/>
+      <w:lvlText w:val=""/>
+      <w:lvlJc w:val="left"/>
+      <w:pPr>
+        <w:tabs>
+          <w:tab w:val="num" w:pos="720"/>
+        </w:tabs>
+        <w:ind w:left="720" w:hanging="360"/>
+      </w:pPr>
+      <w:rPr>
+        <w:rFonts w:ascii="Symbol" w:hAnsi="Symbol" w:hint="default"/>
+        <w:sz w:val="20"/>
+      </w:rPr>
+    </w:lvl>
+    <w:lvl w:ilvl="1" w:tentative="1">
+      <w:start w:val="1"/>
+      <w:numFmt w:val="bullet"/>
+      <w:lvlText w:val="o"/>
+      <w:lvlJc w:val="left"/>
+      <w:pPr>
+        <w:tabs>
+          <w:tab w:val="num" w:pos="1440"/>
+        </w:tabs>
+        <w:ind w:left="1440" w:hanging="360"/>
+      </w:pPr>
+      <w:rPr>
+        <w:rFonts w:ascii="Courier New" w:hAnsi="Courier New" w:hint="default"/>
+        <w:sz w:val="20"/>
+      </w:rPr>
+    </w:lvl>
+    <w:lvl w:ilvl="2" w:tentative="1">
+      <w:start w:val="1"/>
+      <w:numFmt w:val="bullet"/>
+      <w:lvlText w:val=""/>
+      <w:lvlJc w:val="left"/>
+      <w:pPr>
+        <w:tabs>
+          <w:tab w:val="num" w:pos="2160"/>
+        </w:tabs>
+        <w:ind w:left="2160" w:hanging="360"/>
+      </w:pPr>
+      <w:rPr>
+        <w:rFonts w:ascii="Wingdings" w:hAnsi="Wingdings" w:hint="default"/>
+        <w:sz w:val="20"/>
+      </w:rPr>
+    </w:lvl>
+    <w:lvl w:ilvl="3" w:tentative="1">
+      <w:start w:val="1"/>
+      <w:numFmt w:val="bullet"/>
+      <w:lvlText w:val=""/>
+      <w:lvlJc w:val="left"/>
+      <w:pPr>
+        <w:tabs>
+          <w:tab w:val="num" w:pos="2880"/>
+        </w:tabs>
+        <w:ind w:left="2880" w:hanging="360"/>
+      </w:pPr>
+      <w:rPr>
+        <w:rFonts w:ascii="Wingdings" w:hAnsi="Wingdings" w:hint="default"/>
+        <w:sz w:val="20"/>
+      </w:rPr>
+    </w:lvl>
+    <w:lvl w:ilvl="4" w:tentative="1">
+      <w:start w:val="1"/>
+      <w:numFmt w:val="bullet"/>
+      <w:lvlText w:val=""/>
+      <w:lvlJc w:val="left"/>
+      <w:pPr>
+        <w:tabs>
+          <w:tab w:val="num" w:pos="3600"/>
+        </w:tabs>
+        <w:ind w:left="3600" w:hanging="360"/>
+      </w:pPr>
+      <w:rPr>
+        <w:rFonts w:ascii="Wingdings" w:hAnsi="Wingdings" w:hint="default"/>
+        <w:sz w:val="20"/>
+      </w:rPr>
+    </w:lvl>
+    <w:lvl w:ilvl="5" w:tentative="1">
+      <w:start w:val="1"/>
+      <w:numFmt w:val="bullet"/>
+      <w:lvlText w:val=""/>
+      <w:lvlJc w:val="left"/>
+      <w:pPr>
+        <w:tabs>
+          <w:tab w:val="num" w:pos="4320"/>
+        </w:tabs>
+        <w:ind w:left="4320" w:hanging="360"/>
+      </w:pPr>
+      <w:rPr>
+        <w:rFonts w:ascii="Wingdings" w:hAnsi="Wingdings" w:hint="default"/>
+        <w:sz w:val="20"/>
+      </w:rPr>
+    </w:lvl>
+    <w:lvl w:ilvl="6" w:tentative="1">
+      <w:start w:val="1"/>
+      <w:numFmt w:val="bullet"/>
+      <w:lvlText w:val=""/>
+      <w:lvlJc w:val="left"/>
+      <w:pPr>
+        <w:tabs>
+          <w:tab w:val="num" w:pos="5040"/>
+        </w:tabs>
+        <w:ind w:left="5040" w:hanging="360"/>
+      </w:pPr>
+      <w:rPr>
+        <w:rFonts w:ascii="Wingdings" w:hAnsi="Wingdings" w:hint="default"/>
+        <w:sz w:val="20"/>
+      </w:rPr>
+    </w:lvl>
+    <w:lvl w:ilvl="7" w:tentative="1">
+      <w:start w:val="1"/>
+      <w:numFmt w:val="bullet"/>
+      <w:lvlText w:val=""/>
+      <w:lvlJc w:val="left"/>
+      <w:pPr>
+        <w:tabs>
+          <w:tab w:val="num" w:pos="5760"/>
+        </w:tabs>
+        <w:ind w:left="5760" w:hanging="360"/>
+      </w:pPr>
+      <w:rPr>
+        <w:rFonts w:ascii="Wingdings" w:hAnsi="Wingdings" w:hint="default"/>
+        <w:sz w:val="20"/>
+      </w:rPr>
+    </w:lvl>
+    <w:lvl w:ilvl="8" w:tentative="1">
+      <w:start w:val="1"/>
+      <w:numFmt w:val="bullet"/>
+      <w:lvlText w:val=""/>
+      <w:lvlJc w:val="left"/>
+      <w:pPr>
+        <w:tabs>
+          <w:tab w:val="num" w:pos="6480"/>
+        </w:tabs>
+        <w:ind w:left="6480" w:hanging="360"/>
+      </w:pPr>
+      <w:rPr>
+        <w:rFonts w:ascii="Wingdings" w:hAnsi="Wingdings" w:hint="default"/>
+        <w:sz w:val="20"/>
+      </w:rPr>
+    </w:lvl>
+  </w:abstractNum>
+  <w:abstractNum w:abstractNumId="3" w15:restartNumberingAfterBreak="0">
     <w:nsid w:val="35C91AB9"/>
     <w:multiLevelType w:val="multilevel"/>
     <w:tmpl w:val="C28AB706"/>
@@ -991,7 +1340,7 @@
       </w:pPr>
     </w:lvl>
   </w:abstractNum>
-  <w:abstractNum w:abstractNumId="2" w15:restartNumberingAfterBreak="0">
+  <w:abstractNum w:abstractNumId="4" w15:restartNumberingAfterBreak="0">
     <w:nsid w:val="5390711D"/>
     <w:multiLevelType w:val="hybridMultilevel"/>
     <w:tmpl w:val="5D3AF736"/>
@@ -1077,7 +1426,7 @@
       </w:pPr>
     </w:lvl>
   </w:abstractNum>
-  <w:abstractNum w:abstractNumId="3" w15:restartNumberingAfterBreak="0">
+  <w:abstractNum w:abstractNumId="5" w15:restartNumberingAfterBreak="0">
     <w:nsid w:val="54F92BB9"/>
     <w:multiLevelType w:val="hybridMultilevel"/>
     <w:tmpl w:val="369425D8"/>
@@ -1190,7 +1539,156 @@
       </w:rPr>
     </w:lvl>
   </w:abstractNum>
-  <w:abstractNum w:abstractNumId="4" w15:restartNumberingAfterBreak="0">
+  <w:abstractNum w:abstractNumId="6" w15:restartNumberingAfterBreak="0">
+    <w:nsid w:val="62506A21"/>
+    <w:multiLevelType w:val="multilevel"/>
+    <w:tmpl w:val="71DA2E02"/>
+    <w:lvl w:ilvl="0">
+      <w:start w:val="1"/>
+      <w:numFmt w:val="bullet"/>
+      <w:lvlText w:val=""/>
+      <w:lvlJc w:val="left"/>
+      <w:pPr>
+        <w:tabs>
+          <w:tab w:val="num" w:pos="720"/>
+        </w:tabs>
+        <w:ind w:left="720" w:hanging="360"/>
+      </w:pPr>
+      <w:rPr>
+        <w:rFonts w:ascii="Symbol" w:hAnsi="Symbol" w:hint="default"/>
+        <w:sz w:val="20"/>
+      </w:rPr>
+    </w:lvl>
+    <w:lvl w:ilvl="1" w:tentative="1">
+      <w:start w:val="1"/>
+      <w:numFmt w:val="bullet"/>
+      <w:lvlText w:val="o"/>
+      <w:lvlJc w:val="left"/>
+      <w:pPr>
+        <w:tabs>
+          <w:tab w:val="num" w:pos="1440"/>
+        </w:tabs>
+        <w:ind w:left="1440" w:hanging="360"/>
+      </w:pPr>
+      <w:rPr>
+        <w:rFonts w:ascii="Courier New" w:hAnsi="Courier New" w:hint="default"/>
+        <w:sz w:val="20"/>
+      </w:rPr>
+    </w:lvl>
+    <w:lvl w:ilvl="2" w:tentative="1">
+      <w:start w:val="1"/>
+      <w:numFmt w:val="bullet"/>
+      <w:lvlText w:val=""/>
+      <w:lvlJc w:val="left"/>
+      <w:pPr>
+        <w:tabs>
+          <w:tab w:val="num" w:pos="2160"/>
+        </w:tabs>
+        <w:ind w:left="2160" w:hanging="360"/>
+      </w:pPr>
+      <w:rPr>
+        <w:rFonts w:ascii="Wingdings" w:hAnsi="Wingdings" w:hint="default"/>
+        <w:sz w:val="20"/>
+      </w:rPr>
+    </w:lvl>
+    <w:lvl w:ilvl="3" w:tentative="1">
+      <w:start w:val="1"/>
+      <w:numFmt w:val="bullet"/>
+      <w:lvlText w:val=""/>
+      <w:lvlJc w:val="left"/>
+      <w:pPr>
+        <w:tabs>
+          <w:tab w:val="num" w:pos="2880"/>
+        </w:tabs>
+        <w:ind w:left="2880" w:hanging="360"/>
+      </w:pPr>
+      <w:rPr>
+        <w:rFonts w:ascii="Wingdings" w:hAnsi="Wingdings" w:hint="default"/>
+        <w:sz w:val="20"/>
+      </w:rPr>
+    </w:lvl>
+    <w:lvl w:ilvl="4" w:tentative="1">
+      <w:start w:val="1"/>
+      <w:numFmt w:val="bullet"/>
+      <w:lvlText w:val=""/>
+      <w:lvlJc w:val="left"/>
+      <w:pPr>
+        <w:tabs>
+          <w:tab w:val="num" w:pos="3600"/>
+        </w:tabs>
+        <w:ind w:left="3600" w:hanging="360"/>
+      </w:pPr>
+      <w:rPr>
+        <w:rFonts w:ascii="Wingdings" w:hAnsi="Wingdings" w:hint="default"/>
+        <w:sz w:val="20"/>
+      </w:rPr>
+    </w:lvl>
+    <w:lvl w:ilvl="5" w:tentative="1">
+      <w:start w:val="1"/>
+      <w:numFmt w:val="bullet"/>
+      <w:lvlText w:val=""/>
+      <w:lvlJc w:val="left"/>
+      <w:pPr>
+        <w:tabs>
+          <w:tab w:val="num" w:pos="4320"/>
+        </w:tabs>
+        <w:ind w:left="4320" w:hanging="360"/>
+      </w:pPr>
+      <w:rPr>
+        <w:rFonts w:ascii="Wingdings" w:hAnsi="Wingdings" w:hint="default"/>
+        <w:sz w:val="20"/>
+      </w:rPr>
+    </w:lvl>
+    <w:lvl w:ilvl="6" w:tentative="1">
+      <w:start w:val="1"/>
+      <w:numFmt w:val="bullet"/>
+      <w:lvlText w:val=""/>
+      <w:lvlJc w:val="left"/>
+      <w:pPr>
+        <w:tabs>
+          <w:tab w:val="num" w:pos="5040"/>
+        </w:tabs>
+        <w:ind w:left="5040" w:hanging="360"/>
+      </w:pPr>
+      <w:rPr>
+        <w:rFonts w:ascii="Wingdings" w:hAnsi="Wingdings" w:hint="default"/>
+        <w:sz w:val="20"/>
+      </w:rPr>
+    </w:lvl>
+    <w:lvl w:ilvl="7" w:tentative="1">
+      <w:start w:val="1"/>
+      <w:numFmt w:val="bullet"/>
+      <w:lvlText w:val=""/>
+      <w:lvlJc w:val="left"/>
+      <w:pPr>
+        <w:tabs>
+          <w:tab w:val="num" w:pos="5760"/>
+        </w:tabs>
+        <w:ind w:left="5760" w:hanging="360"/>
+      </w:pPr>
+      <w:rPr>
+        <w:rFonts w:ascii="Wingdings" w:hAnsi="Wingdings" w:hint="default"/>
+        <w:sz w:val="20"/>
+      </w:rPr>
+    </w:lvl>
+    <w:lvl w:ilvl="8" w:tentative="1">
+      <w:start w:val="1"/>
+      <w:numFmt w:val="bullet"/>
+      <w:lvlText w:val=""/>
+      <w:lvlJc w:val="left"/>
+      <w:pPr>
+        <w:tabs>
+          <w:tab w:val="num" w:pos="6480"/>
+        </w:tabs>
+        <w:ind w:left="6480" w:hanging="360"/>
+      </w:pPr>
+      <w:rPr>
+        <w:rFonts w:ascii="Wingdings" w:hAnsi="Wingdings" w:hint="default"/>
+        <w:sz w:val="20"/>
+      </w:rPr>
+    </w:lvl>
+  </w:abstractNum>
+  <w:abstractNum w:abstractNumId="7" w15:restartNumberingAfterBreak="0">
     <w:nsid w:val="752A0F00"/>
     <w:multiLevelType w:val="hybridMultilevel"/>
     <w:tmpl w:val="3B802590"/>
@@ -1303,20 +1801,181 @@
       </w:rPr>
     </w:lvl>
   </w:abstractNum>
+  <w:abstractNum w:abstractNumId="8" w15:restartNumberingAfterBreak="0">
+    <w:nsid w:val="78FE7B5B"/>
+    <w:multiLevelType w:val="multilevel"/>
+    <w:tmpl w:val="60DEBD18"/>
+    <w:lvl w:ilvl="0">
+      <w:start w:val="1"/>
+      <w:numFmt w:val="bullet"/>
+      <w:lvlText w:val=""/>
+      <w:lvlJc w:val="left"/>
+      <w:pPr>
+        <w:tabs>
+          <w:tab w:val="num" w:pos="720"/>
+        </w:tabs>
+        <w:ind w:left="720" w:hanging="360"/>
+      </w:pPr>
+      <w:rPr>
+        <w:rFonts w:ascii="Symbol" w:hAnsi="Symbol" w:hint="default"/>
+        <w:sz w:val="20"/>
+      </w:rPr>
+    </w:lvl>
+    <w:lvl w:ilvl="1" w:tentative="1">
+      <w:start w:val="1"/>
+      <w:numFmt w:val="bullet"/>
+      <w:lvlText w:val="o"/>
+      <w:lvlJc w:val="left"/>
+      <w:pPr>
+        <w:tabs>
+          <w:tab w:val="num" w:pos="1440"/>
+        </w:tabs>
+        <w:ind w:left="1440" w:hanging="360"/>
+      </w:pPr>
+      <w:rPr>
+        <w:rFonts w:ascii="Courier New" w:hAnsi="Courier New" w:hint="default"/>
+        <w:sz w:val="20"/>
+      </w:rPr>
+    </w:lvl>
+    <w:lvl w:ilvl="2" w:tentative="1">
+      <w:start w:val="1"/>
+      <w:numFmt w:val="bullet"/>
+      <w:lvlText w:val=""/>
+      <w:lvlJc w:val="left"/>
+      <w:pPr>
+        <w:tabs>
+          <w:tab w:val="num" w:pos="2160"/>
+        </w:tabs>
+        <w:ind w:left="2160" w:hanging="360"/>
+      </w:pPr>
+      <w:rPr>
+        <w:rFonts w:ascii="Wingdings" w:hAnsi="Wingdings" w:hint="default"/>
+        <w:sz w:val="20"/>
+      </w:rPr>
+    </w:lvl>
+    <w:lvl w:ilvl="3" w:tentative="1">
+      <w:start w:val="1"/>
+      <w:numFmt w:val="bullet"/>
+      <w:lvlText w:val=""/>
+      <w:lvlJc w:val="left"/>
+      <w:pPr>
+        <w:tabs>
+          <w:tab w:val="num" w:pos="2880"/>
+        </w:tabs>
+        <w:ind w:left="2880" w:hanging="360"/>
+      </w:pPr>
+      <w:rPr>
+        <w:rFonts w:ascii="Wingdings" w:hAnsi="Wingdings" w:hint="default"/>
+        <w:sz w:val="20"/>
+      </w:rPr>
+    </w:lvl>
+    <w:lvl w:ilvl="4" w:tentative="1">
+      <w:start w:val="1"/>
+      <w:numFmt w:val="bullet"/>
+      <w:lvlText w:val=""/>
+      <w:lvlJc w:val="left"/>
+      <w:pPr>
+        <w:tabs>
+          <w:tab w:val="num" w:pos="3600"/>
+        </w:tabs>
+        <w:ind w:left="3600" w:hanging="360"/>
+      </w:pPr>
+      <w:rPr>
+        <w:rFonts w:ascii="Wingdings" w:hAnsi="Wingdings" w:hint="default"/>
+        <w:sz w:val="20"/>
+      </w:rPr>
+    </w:lvl>
+    <w:lvl w:ilvl="5" w:tentative="1">
+      <w:start w:val="1"/>
+      <w:numFmt w:val="bullet"/>
+      <w:lvlText w:val=""/>
+      <w:lvlJc w:val="left"/>
+      <w:pPr>
+        <w:tabs>
+          <w:tab w:val="num" w:pos="4320"/>
+        </w:tabs>
+        <w:ind w:left="4320" w:hanging="360"/>
+      </w:pPr>
+      <w:rPr>
+        <w:rFonts w:ascii="Wingdings" w:hAnsi="Wingdings" w:hint="default"/>
+        <w:sz w:val="20"/>
+      </w:rPr>
+    </w:lvl>
+    <w:lvl w:ilvl="6" w:tentative="1">
+      <w:start w:val="1"/>
+      <w:numFmt w:val="bullet"/>
+      <w:lvlText w:val=""/>
+      <w:lvlJc w:val="left"/>
+      <w:pPr>
+        <w:tabs>
+          <w:tab w:val="num" w:pos="5040"/>
+        </w:tabs>
+        <w:ind w:left="5040" w:hanging="360"/>
+      </w:pPr>
+      <w:rPr>
+        <w:rFonts w:ascii="Wingdings" w:hAnsi="Wingdings" w:hint="default"/>
+        <w:sz w:val="20"/>
+      </w:rPr>
+    </w:lvl>
+    <w:lvl w:ilvl="7" w:tentative="1">
+      <w:start w:val="1"/>
+      <w:numFmt w:val="bullet"/>
+      <w:lvlText w:val=""/>
+      <w:lvlJc w:val="left"/>
+      <w:pPr>
+        <w:tabs>
+          <w:tab w:val="num" w:pos="5760"/>
+        </w:tabs>
+        <w:ind w:left="5760" w:hanging="360"/>
+      </w:pPr>
+      <w:rPr>
+        <w:rFonts w:ascii="Wingdings" w:hAnsi="Wingdings" w:hint="default"/>
+        <w:sz w:val="20"/>
+      </w:rPr>
+    </w:lvl>
+    <w:lvl w:ilvl="8" w:tentative="1">
+      <w:start w:val="1"/>
+      <w:numFmt w:val="bullet"/>
+      <w:lvlText w:val=""/>
+      <w:lvlJc w:val="left"/>
+      <w:pPr>
+        <w:tabs>
+          <w:tab w:val="num" w:pos="6480"/>
+        </w:tabs>
+        <w:ind w:left="6480" w:hanging="360"/>
+      </w:pPr>
+      <w:rPr>
+        <w:rFonts w:ascii="Wingdings" w:hAnsi="Wingdings" w:hint="default"/>
+        <w:sz w:val="20"/>
+      </w:rPr>
+    </w:lvl>
+  </w:abstractNum>
   <w:num w:numId="1" w16cid:durableId="75828082">
-    <w:abstractNumId w:val="1"/>
+    <w:abstractNumId w:val="3"/>
   </w:num>
   <w:num w:numId="2" w16cid:durableId="767501410">
     <w:abstractNumId w:val="0"/>
   </w:num>
   <w:num w:numId="3" w16cid:durableId="610865678">
+    <w:abstractNumId w:val="4"/>
+  </w:num>
+  <w:num w:numId="4" w16cid:durableId="1332021970">
+    <w:abstractNumId w:val="5"/>
+  </w:num>
+  <w:num w:numId="5" w16cid:durableId="2008970310">
+    <w:abstractNumId w:val="7"/>
+  </w:num>
+  <w:num w:numId="6" w16cid:durableId="1887717723">
+    <w:abstractNumId w:val="8"/>
+  </w:num>
+  <w:num w:numId="7" w16cid:durableId="690229795">
+    <w:abstractNumId w:val="6"/>
+  </w:num>
+  <w:num w:numId="8" w16cid:durableId="933633804">
     <w:abstractNumId w:val="2"/>
   </w:num>
-  <w:num w:numId="4" w16cid:durableId="1332021970">
-    <w:abstractNumId w:val="3"/>
-  </w:num>
-  <w:num w:numId="5" w16cid:durableId="2008970310">
-    <w:abstractNumId w:val="4"/>
+  <w:num w:numId="9" w16cid:durableId="313726680">
+    <w:abstractNumId w:val="1"/>
   </w:num>
 </w:numbering>
 </file>
@@ -1944,7 +2603,6 @@
   <w:style w:type="character" w:default="1" w:styleId="DefaultParagraphFont">
     <w:name w:val="Default Paragraph Font"/>
     <w:uiPriority w:val="1"/>
-    <w:semiHidden/>
     <w:unhideWhenUsed/>
   </w:style>
   <w:style w:type="table" w:default="1" w:styleId="TableNormal">
@@ -2289,6 +2947,17 @@
     <w:rPr>
       <w:color w:val="605E5C"/>
       <w:shd w:val="clear" w:color="auto" w:fill="E1DFDD"/>
+    </w:rPr>
+  </w:style>
+  <w:style w:type="paragraph" w:styleId="NormalWeb">
+    <w:name w:val="Normal (Web)"/>
+    <w:basedOn w:val="Normal"/>
+    <w:uiPriority w:val="99"/>
+    <w:semiHidden/>
+    <w:unhideWhenUsed/>
+    <w:rsid w:val="00D06D9A"/>
+    <w:rPr>
+      <w:rFonts w:ascii="Times New Roman" w:hAnsi="Times New Roman" w:cs="Times New Roman"/>
     </w:rPr>
   </w:style>
 </w:styles>

</xml_diff>